<commit_message>
feat(contrato): ajustes de formatação da minuta
- remove marca-texto amarelo de todo o documento
- remove negrito de CNPJ, endereço, CEP e dados do representante
- endereço em Title Case; CEP no padrão NN.NNN-NNN
- data de assinatura dinâmica (= data de geração, por extenso)

Co-Authored-By: Claude Opus 4.8 (1M context) <noreply@anthropic.com>
</commit_message>
<xml_diff>
--- a/templates/contrato-prestacao-servicos.docx
+++ b/templates/contrato-prestacao-servicos.docx
@@ -165,62 +165,48 @@
           <w:rFonts w:ascii="Calibri" w:hAnsi="Calibri" w:cs="Calibri"/>
           <w:b/>
           <w:bCs/>
-          <w:highlight w:val="yellow"/>
         </w:rPr>
         <w:t>{razao_social}</w:t>
       </w:r>
       <w:r>
         <w:rPr>
           <w:rFonts w:ascii="Calibri" w:hAnsi="Calibri" w:cs="Calibri"/>
-          <w:highlight w:val="yellow"/>
         </w:rPr>
         <w:t xml:space="preserve">, pessoa jurídica de direito privado, inscrita no CNPJ sob o nº </w:t>
       </w:r>
       <w:r>
         <w:rPr>
           <w:rFonts w:ascii="Calibri" w:hAnsi="Calibri" w:cs="Calibri"/>
-          <w:b/>
-          <w:bCs/>
-          <w:highlight w:val="yellow"/>
         </w:rPr>
         <w:t>{cnpj}</w:t>
       </w:r>
       <w:r>
         <w:rPr>
           <w:rFonts w:ascii="Calibri" w:hAnsi="Calibri" w:cs="Calibri"/>
-          <w:highlight w:val="yellow"/>
         </w:rPr>
         <w:t xml:space="preserve">, com sede na </w:t>
       </w:r>
       <w:r>
         <w:rPr>
           <w:rFonts w:ascii="Calibri" w:hAnsi="Calibri" w:cs="Calibri"/>
-          <w:b/>
-          <w:bCs/>
-          <w:highlight w:val="yellow"/>
         </w:rPr>
         <w:t>{endereco}</w:t>
       </w:r>
       <w:r>
         <w:rPr>
           <w:rFonts w:ascii="Calibri" w:hAnsi="Calibri" w:cs="Calibri"/>
-          <w:highlight w:val="yellow"/>
         </w:rPr>
         <w:t xml:space="preserve">, CEP </w:t>
       </w:r>
       <w:r>
         <w:rPr>
           <w:rFonts w:ascii="Calibri" w:hAnsi="Calibri" w:cs="Calibri"/>
-          <w:b/>
-          <w:bCs/>
-          <w:highlight w:val="yellow"/>
         </w:rPr>
         <w:t>{cep}</w:t>
       </w:r>
       <w:r>
         <w:rPr>
           <w:rFonts w:ascii="Calibri" w:hAnsi="Calibri" w:cs="Calibri"/>
-          <w:highlight w:val="yellow"/>
         </w:rPr>
         <w:t xml:space="preserve">, e-mail </w:t>
       </w:r>
@@ -229,14 +215,12 @@
           <w:rFonts w:ascii="Calibri" w:hAnsi="Calibri" w:cs="Calibri"/>
           <w:b/>
           <w:bCs/>
-          <w:highlight w:val="yellow"/>
         </w:rPr>
         <w:t>{email}</w:t>
       </w:r>
       <w:r>
         <w:rPr>
           <w:rFonts w:ascii="Calibri" w:hAnsi="Calibri" w:cs="Calibri"/>
-          <w:highlight w:val="yellow"/>
         </w:rPr>
         <w:t xml:space="preserve">, telefone </w:t>
       </w:r>
@@ -245,14 +229,12 @@
           <w:rFonts w:ascii="Calibri" w:hAnsi="Calibri" w:cs="Calibri"/>
           <w:b/>
           <w:bCs/>
-          <w:highlight w:val="yellow"/>
         </w:rPr>
         <w:t>{telefone}</w:t>
       </w:r>
       <w:r>
         <w:rPr>
           <w:rFonts w:ascii="Calibri" w:hAnsi="Calibri" w:cs="Calibri"/>
-          <w:highlight w:val="yellow"/>
         </w:rPr>
         <w:t xml:space="preserve">, neste ato representada na forma de seus atos constitutivos por </w:t>
       </w:r>
@@ -261,87 +243,66 @@
           <w:rFonts w:ascii="Calibri" w:hAnsi="Calibri" w:cs="Calibri"/>
           <w:b/>
           <w:bCs/>
-          <w:highlight w:val="yellow"/>
         </w:rPr>
         <w:t>{rep_nome}</w:t>
       </w:r>
       <w:r>
         <w:rPr>
           <w:rFonts w:ascii="Calibri" w:hAnsi="Calibri" w:cs="Calibri"/>
-          <w:highlight w:val="yellow"/>
         </w:rPr>
         <w:t xml:space="preserve">, </w:t>
       </w:r>
       <w:r>
         <w:rPr>
           <w:rFonts w:ascii="Calibri" w:hAnsi="Calibri" w:cs="Calibri"/>
-          <w:b/>
-          <w:bCs/>
-          <w:highlight w:val="yellow"/>
         </w:rPr>
         <w:t>{rep_nacionalidade}</w:t>
       </w:r>
       <w:r>
         <w:rPr>
           <w:rFonts w:ascii="Calibri" w:hAnsi="Calibri" w:cs="Calibri"/>
-          <w:highlight w:val="yellow"/>
         </w:rPr>
         <w:t xml:space="preserve">, </w:t>
       </w:r>
       <w:r>
         <w:rPr>
           <w:rFonts w:ascii="Calibri" w:hAnsi="Calibri" w:cs="Calibri"/>
-          <w:b/>
-          <w:bCs/>
-          <w:highlight w:val="yellow"/>
         </w:rPr>
         <w:t>{rep_estado_civil}</w:t>
       </w:r>
       <w:r>
         <w:rPr>
           <w:rFonts w:ascii="Calibri" w:hAnsi="Calibri" w:cs="Calibri"/>
-          <w:highlight w:val="yellow"/>
         </w:rPr>
         <w:t xml:space="preserve">, </w:t>
       </w:r>
       <w:r>
         <w:rPr>
           <w:rFonts w:ascii="Calibri" w:hAnsi="Calibri" w:cs="Calibri"/>
-          <w:b/>
-          <w:bCs/>
-          <w:highlight w:val="yellow"/>
         </w:rPr>
         <w:t>{rep_profissao}</w:t>
       </w:r>
       <w:r>
         <w:rPr>
           <w:rFonts w:ascii="Calibri" w:hAnsi="Calibri" w:cs="Calibri"/>
-          <w:highlight w:val="yellow"/>
         </w:rPr>
         <w:t xml:space="preserve">, portador do RG nº </w:t>
       </w:r>
       <w:r>
         <w:rPr>
           <w:rFonts w:ascii="Calibri" w:hAnsi="Calibri" w:cs="Calibri"/>
-          <w:b/>
-          <w:bCs/>
-          <w:highlight w:val="yellow"/>
         </w:rPr>
         <w:t>{rep_rg}</w:t>
       </w:r>
       <w:r>
         <w:rPr>
           <w:rFonts w:ascii="Calibri" w:hAnsi="Calibri" w:cs="Calibri"/>
-          <w:highlight w:val="yellow"/>
         </w:rPr>
         <w:t xml:space="preserve"> e inscrito no CPF sob o nº </w:t>
       </w:r>
       <w:r>
         <w:rPr>
           <w:rFonts w:ascii="Calibri" w:hAnsi="Calibri" w:cs="Calibri"/>
-          <w:b/>
-          <w:bCs/>
-          <w:highlight w:val="yellow"/>
         </w:rPr>
         <w:t>{rep_cpf}</w:t>
       </w:r>
@@ -1909,7 +1870,6 @@
           <w:rFonts w:ascii="Calibri" w:hAnsi="Calibri" w:cs="Calibri"/>
           <w:b/>
           <w:bCs/>
-          <w:highlight w:val="yellow"/>
         </w:rPr>
         <w:t>R$ {honorario} ({honorario_extenso})</w:t>
       </w:r>
@@ -3356,38 +3316,8 @@
       <w:r>
         <w:rPr>
           <w:rFonts w:ascii="Calibri" w:hAnsi="Calibri" w:cs="Calibri"/>
-          <w:b/>
-          <w:bCs/>
-        </w:rPr>
-        <w:t>11</w:t>
-      </w:r>
-      <w:r>
-        <w:rPr>
-          <w:rFonts w:ascii="Calibri" w:hAnsi="Calibri" w:cs="Calibri"/>
-        </w:rPr>
-        <w:t xml:space="preserve"> de </w:t>
-      </w:r>
-      <w:r>
-        <w:rPr>
-          <w:rFonts w:ascii="Calibri" w:hAnsi="Calibri" w:cs="Calibri"/>
-          <w:b/>
-          <w:bCs/>
-        </w:rPr>
-        <w:t>junho</w:t>
-      </w:r>
-      <w:r>
-        <w:rPr>
-          <w:rFonts w:ascii="Calibri" w:hAnsi="Calibri" w:cs="Calibri"/>
-        </w:rPr>
-        <w:t xml:space="preserve"> de </w:t>
-      </w:r>
-      <w:r>
-        <w:rPr>
-          <w:rFonts w:ascii="Calibri" w:hAnsi="Calibri" w:cs="Calibri"/>
-          <w:b/>
-          <w:bCs/>
-        </w:rPr>
-        <w:t>2026</w:t>
+        </w:rPr>
+        <w:t>{data_assinatura}</w:t>
       </w:r>
       <w:r>
         <w:rPr>
@@ -3492,7 +3422,6 @@
           <w:rFonts w:ascii="Calibri" w:hAnsi="Calibri" w:cs="Calibri"/>
           <w:b/>
           <w:bCs/>
-          <w:highlight w:val="yellow"/>
         </w:rPr>
         <w:t>{razao_social}</w:t>
       </w:r>

</xml_diff>

<commit_message>
feat(contrato): e-mail/telefone/representante sem negrito; telefone formatado; nome em Title Case
Co-Authored-By: Claude Opus 4.8 (1M context) <noreply@anthropic.com>
</commit_message>
<xml_diff>
--- a/templates/contrato-prestacao-servicos.docx
+++ b/templates/contrato-prestacao-servicos.docx
@@ -213,8 +213,6 @@
       <w:r>
         <w:rPr>
           <w:rFonts w:ascii="Calibri" w:hAnsi="Calibri" w:cs="Calibri"/>
-          <w:b/>
-          <w:bCs/>
         </w:rPr>
         <w:t>{email}</w:t>
       </w:r>
@@ -227,8 +225,6 @@
       <w:r>
         <w:rPr>
           <w:rFonts w:ascii="Calibri" w:hAnsi="Calibri" w:cs="Calibri"/>
-          <w:b/>
-          <w:bCs/>
         </w:rPr>
         <w:t>{telefone}</w:t>
       </w:r>
@@ -241,8 +237,6 @@
       <w:r>
         <w:rPr>
           <w:rFonts w:ascii="Calibri" w:hAnsi="Calibri" w:cs="Calibri"/>
-          <w:b/>
-          <w:bCs/>
         </w:rPr>
         <w:t>{rep_nome}</w:t>
       </w:r>

</xml_diff>

<commit_message>
feat(contrato): e-mail da CONTRATANTE como hyperlink (azul/sublinhado) + mailto dinâmico
gerarDocx passa a preencher tags também no document.xml.rels, permitindo o
mailto: apontar para o e-mail real do cliente.

Co-Authored-By: Claude Opus 4.8 (1M context) <noreply@anthropic.com>
</commit_message>
<xml_diff>
--- a/templates/contrato-prestacao-servicos.docx
+++ b/templates/contrato-prestacao-servicos.docx
@@ -210,12 +210,15 @@
         </w:rPr>
         <w:t xml:space="preserve">, e-mail </w:t>
       </w:r>
-      <w:r>
-        <w:rPr>
-          <w:rFonts w:ascii="Calibri" w:hAnsi="Calibri" w:cs="Calibri"/>
-        </w:rPr>
-        <w:t>{email}</w:t>
-      </w:r>
+      <w:hyperlink r:id="rId100" w:history="1">
+        <w:r>
+          <w:rPr>
+            <w:rStyle w:val="Hyperlink"/>
+            <w:rFonts w:ascii="Calibri" w:hAnsi="Calibri" w:cs="Calibri"/>
+          </w:rPr>
+          <w:t>{email}</w:t>
+        </w:r>
+      </w:hyperlink>
       <w:r>
         <w:rPr>
           <w:rFonts w:ascii="Calibri" w:hAnsi="Calibri" w:cs="Calibri"/>

</xml_diff>